<commit_message>
updated report and added default commnet for inspectio item on checklist
</commit_message>
<xml_diff>
--- a/backend/templates/report_template.docx
+++ b/backend/templates/report_template.docx
@@ -563,9 +563,9 @@
         <w:p>
           <w:pPr>
             <w:pStyle w:val="TOC1"/>
-            <w:ind w:right="168" w:firstLine="0"/>
+            <w:ind w:right="-12" w:firstLine="0"/>
             <w:rPr>
-              <w:rFonts w:eastAsiaTheme="minorEastAsia"/>
+              <w:rFonts w:asciiTheme="minorHAnsi" w:eastAsiaTheme="minorEastAsia" w:hAnsiTheme="minorHAnsi" w:cstheme="minorBidi"/>
               <w:b w:val="0"/>
               <w:bCs w:val="0"/>
               <w:noProof/>
@@ -585,7 +585,7 @@
           <w:r>
             <w:fldChar w:fldCharType="separate"/>
           </w:r>
-          <w:hyperlink w:anchor="_Toc216005715" w:history="1">
+          <w:hyperlink w:anchor="_Toc227670200" w:history="1">
             <w:r>
               <w:rPr>
                 <w:rStyle w:val="Hyperlink"/>
@@ -612,7 +612,7 @@
                 <w:noProof/>
                 <w:webHidden/>
               </w:rPr>
-              <w:instrText xml:space="preserve"> PAGEREF _Toc216005715 \h </w:instrText>
+              <w:instrText xml:space="preserve"> PAGEREF _Toc227670200 \h </w:instrText>
             </w:r>
             <w:r>
               <w:rPr>
@@ -646,9 +646,9 @@
         <w:p>
           <w:pPr>
             <w:pStyle w:val="TOC1"/>
-            <w:ind w:right="168" w:firstLine="0"/>
+            <w:ind w:right="-12" w:firstLine="0"/>
             <w:rPr>
-              <w:rFonts w:eastAsiaTheme="minorEastAsia"/>
+              <w:rFonts w:asciiTheme="minorHAnsi" w:eastAsiaTheme="minorEastAsia" w:hAnsiTheme="minorHAnsi" w:cstheme="minorBidi"/>
               <w:b w:val="0"/>
               <w:bCs w:val="0"/>
               <w:noProof/>
@@ -659,7 +659,7 @@
               <w14:ligatures w14:val="standardContextual"/>
             </w:rPr>
           </w:pPr>
-          <w:hyperlink w:anchor="_Toc216005716" w:history="1">
+          <w:hyperlink w:anchor="_Toc227670201" w:history="1">
             <w:r>
               <w:rPr>
                 <w:rStyle w:val="Hyperlink"/>
@@ -686,7 +686,7 @@
                 <w:noProof/>
                 <w:webHidden/>
               </w:rPr>
-              <w:instrText xml:space="preserve"> PAGEREF _Toc216005716 \h </w:instrText>
+              <w:instrText xml:space="preserve"> PAGEREF _Toc227670201 \h </w:instrText>
             </w:r>
             <w:r>
               <w:rPr>
@@ -720,9 +720,9 @@
         <w:p>
           <w:pPr>
             <w:pStyle w:val="TOC1"/>
-            <w:ind w:right="168" w:firstLine="0"/>
+            <w:ind w:right="-12" w:firstLine="0"/>
             <w:rPr>
-              <w:rFonts w:eastAsiaTheme="minorEastAsia"/>
+              <w:rFonts w:asciiTheme="minorHAnsi" w:eastAsiaTheme="minorEastAsia" w:hAnsiTheme="minorHAnsi" w:cstheme="minorBidi"/>
               <w:b w:val="0"/>
               <w:bCs w:val="0"/>
               <w:noProof/>
@@ -733,7 +733,7 @@
               <w14:ligatures w14:val="standardContextual"/>
             </w:rPr>
           </w:pPr>
-          <w:hyperlink w:anchor="_Toc216005717" w:history="1">
+          <w:hyperlink w:anchor="_Toc227670202" w:history="1">
             <w:r>
               <w:rPr>
                 <w:rStyle w:val="Hyperlink"/>
@@ -760,7 +760,7 @@
                 <w:noProof/>
                 <w:webHidden/>
               </w:rPr>
-              <w:instrText xml:space="preserve"> PAGEREF _Toc216005717 \h </w:instrText>
+              <w:instrText xml:space="preserve"> PAGEREF _Toc227670202 \h </w:instrText>
             </w:r>
             <w:r>
               <w:rPr>
@@ -794,9 +794,9 @@
         <w:p>
           <w:pPr>
             <w:pStyle w:val="TOC1"/>
-            <w:ind w:right="168" w:firstLine="0"/>
+            <w:ind w:right="-12" w:firstLine="0"/>
             <w:rPr>
-              <w:rFonts w:eastAsiaTheme="minorEastAsia"/>
+              <w:rFonts w:asciiTheme="minorHAnsi" w:eastAsiaTheme="minorEastAsia" w:hAnsiTheme="minorHAnsi" w:cstheme="minorBidi"/>
               <w:b w:val="0"/>
               <w:bCs w:val="0"/>
               <w:noProof/>
@@ -807,7 +807,7 @@
               <w14:ligatures w14:val="standardContextual"/>
             </w:rPr>
           </w:pPr>
-          <w:hyperlink w:anchor="_Toc216005718" w:history="1">
+          <w:hyperlink w:anchor="_Toc227670203" w:history="1">
             <w:r>
               <w:rPr>
                 <w:rStyle w:val="Hyperlink"/>
@@ -834,7 +834,7 @@
                 <w:noProof/>
                 <w:webHidden/>
               </w:rPr>
-              <w:instrText xml:space="preserve"> PAGEREF _Toc216005718 \h </w:instrText>
+              <w:instrText xml:space="preserve"> PAGEREF _Toc227670203 \h </w:instrText>
             </w:r>
             <w:r>
               <w:rPr>
@@ -868,9 +868,9 @@
         <w:p>
           <w:pPr>
             <w:pStyle w:val="TOC1"/>
-            <w:ind w:right="168" w:firstLine="0"/>
+            <w:ind w:right="-12" w:firstLine="0"/>
             <w:rPr>
-              <w:rFonts w:eastAsiaTheme="minorEastAsia"/>
+              <w:rFonts w:asciiTheme="minorHAnsi" w:eastAsiaTheme="minorEastAsia" w:hAnsiTheme="minorHAnsi" w:cstheme="minorBidi"/>
               <w:b w:val="0"/>
               <w:bCs w:val="0"/>
               <w:noProof/>
@@ -881,7 +881,7 @@
               <w14:ligatures w14:val="standardContextual"/>
             </w:rPr>
           </w:pPr>
-          <w:hyperlink w:anchor="_Toc216005719" w:history="1">
+          <w:hyperlink w:anchor="_Toc227670204" w:history="1">
             <w:r>
               <w:rPr>
                 <w:rStyle w:val="Hyperlink"/>
@@ -908,7 +908,7 @@
                 <w:noProof/>
                 <w:webHidden/>
               </w:rPr>
-              <w:instrText xml:space="preserve"> PAGEREF _Toc216005719 \h </w:instrText>
+              <w:instrText xml:space="preserve"> PAGEREF _Toc227670204 \h </w:instrText>
             </w:r>
             <w:r>
               <w:rPr>
@@ -942,9 +942,9 @@
         <w:p>
           <w:pPr>
             <w:pStyle w:val="TOC1"/>
-            <w:ind w:right="168" w:firstLine="0"/>
+            <w:ind w:right="-12" w:firstLine="0"/>
             <w:rPr>
-              <w:rFonts w:eastAsiaTheme="minorEastAsia"/>
+              <w:rFonts w:asciiTheme="minorHAnsi" w:eastAsiaTheme="minorEastAsia" w:hAnsiTheme="minorHAnsi" w:cstheme="minorBidi"/>
               <w:b w:val="0"/>
               <w:bCs w:val="0"/>
               <w:noProof/>
@@ -955,7 +955,7 @@
               <w14:ligatures w14:val="standardContextual"/>
             </w:rPr>
           </w:pPr>
-          <w:hyperlink w:anchor="_Toc216005720" w:history="1">
+          <w:hyperlink w:anchor="_Toc227670205" w:history="1">
             <w:r>
               <w:rPr>
                 <w:rStyle w:val="Hyperlink"/>
@@ -982,7 +982,7 @@
                 <w:noProof/>
                 <w:webHidden/>
               </w:rPr>
-              <w:instrText xml:space="preserve"> PAGEREF _Toc216005720 \h </w:instrText>
+              <w:instrText xml:space="preserve"> PAGEREF _Toc227670205 \h </w:instrText>
             </w:r>
             <w:r>
               <w:rPr>
@@ -1016,9 +1016,9 @@
         <w:p>
           <w:pPr>
             <w:pStyle w:val="TOC1"/>
-            <w:ind w:right="168" w:firstLine="0"/>
+            <w:ind w:right="-12" w:firstLine="0"/>
             <w:rPr>
-              <w:rFonts w:eastAsiaTheme="minorEastAsia"/>
+              <w:rFonts w:asciiTheme="minorHAnsi" w:eastAsiaTheme="minorEastAsia" w:hAnsiTheme="minorHAnsi" w:cstheme="minorBidi"/>
               <w:b w:val="0"/>
               <w:bCs w:val="0"/>
               <w:noProof/>
@@ -1029,7 +1029,7 @@
               <w14:ligatures w14:val="standardContextual"/>
             </w:rPr>
           </w:pPr>
-          <w:hyperlink w:anchor="_Toc216005721" w:history="1">
+          <w:hyperlink w:anchor="_Toc227670206" w:history="1">
             <w:r>
               <w:rPr>
                 <w:rStyle w:val="Hyperlink"/>
@@ -1056,7 +1056,7 @@
                 <w:noProof/>
                 <w:webHidden/>
               </w:rPr>
-              <w:instrText xml:space="preserve"> PAGEREF _Toc216005721 \h </w:instrText>
+              <w:instrText xml:space="preserve"> PAGEREF _Toc227670206 \h </w:instrText>
             </w:r>
             <w:r>
               <w:rPr>
@@ -1090,9 +1090,9 @@
         <w:p>
           <w:pPr>
             <w:pStyle w:val="TOC1"/>
-            <w:ind w:right="168" w:firstLine="0"/>
+            <w:ind w:right="-12" w:firstLine="0"/>
             <w:rPr>
-              <w:rFonts w:eastAsiaTheme="minorEastAsia"/>
+              <w:rFonts w:asciiTheme="minorHAnsi" w:eastAsiaTheme="minorEastAsia" w:hAnsiTheme="minorHAnsi" w:cstheme="minorBidi"/>
               <w:b w:val="0"/>
               <w:bCs w:val="0"/>
               <w:noProof/>
@@ -1103,7 +1103,7 @@
               <w14:ligatures w14:val="standardContextual"/>
             </w:rPr>
           </w:pPr>
-          <w:hyperlink w:anchor="_Toc216005722" w:history="1">
+          <w:hyperlink w:anchor="_Toc227670207" w:history="1">
             <w:r>
               <w:rPr>
                 <w:rStyle w:val="Hyperlink"/>
@@ -1130,7 +1130,7 @@
                 <w:noProof/>
                 <w:webHidden/>
               </w:rPr>
-              <w:instrText xml:space="preserve"> PAGEREF _Toc216005722 \h </w:instrText>
+              <w:instrText xml:space="preserve"> PAGEREF _Toc227670207 \h </w:instrText>
             </w:r>
             <w:r>
               <w:rPr>
@@ -1164,9 +1164,9 @@
         <w:p>
           <w:pPr>
             <w:pStyle w:val="TOC1"/>
-            <w:ind w:right="168" w:firstLine="0"/>
+            <w:ind w:right="-12" w:firstLine="0"/>
             <w:rPr>
-              <w:rFonts w:eastAsiaTheme="minorEastAsia"/>
+              <w:rFonts w:asciiTheme="minorHAnsi" w:eastAsiaTheme="minorEastAsia" w:hAnsiTheme="minorHAnsi" w:cstheme="minorBidi"/>
               <w:b w:val="0"/>
               <w:bCs w:val="0"/>
               <w:noProof/>
@@ -1177,13 +1177,13 @@
               <w14:ligatures w14:val="standardContextual"/>
             </w:rPr>
           </w:pPr>
-          <w:hyperlink w:anchor="_Toc216005723" w:history="1">
+          <w:hyperlink w:anchor="_Toc227670208" w:history="1">
             <w:r>
               <w:rPr>
                 <w:rStyle w:val="Hyperlink"/>
                 <w:noProof/>
               </w:rPr>
-              <w:t>SITE DETAILS</w:t>
+              <w:t>RECOMMENDATIONS</w:t>
             </w:r>
             <w:r>
               <w:rPr>
@@ -1204,7 +1204,7 @@
                 <w:noProof/>
                 <w:webHidden/>
               </w:rPr>
-              <w:instrText xml:space="preserve"> PAGEREF _Toc216005723 \h </w:instrText>
+              <w:instrText xml:space="preserve"> PAGEREF _Toc227670208 \h </w:instrText>
             </w:r>
             <w:r>
               <w:rPr>
@@ -1224,7 +1224,7 @@
                 <w:noProof/>
                 <w:webHidden/>
               </w:rPr>
-              <w:t>12</w:t>
+              <w:t>13</w:t>
             </w:r>
             <w:r>
               <w:rPr>
@@ -1238,9 +1238,9 @@
         <w:p>
           <w:pPr>
             <w:pStyle w:val="TOC1"/>
-            <w:ind w:right="168" w:firstLine="0"/>
+            <w:ind w:right="-12" w:firstLine="0"/>
             <w:rPr>
-              <w:rFonts w:eastAsiaTheme="minorEastAsia"/>
+              <w:rFonts w:asciiTheme="minorHAnsi" w:eastAsiaTheme="minorEastAsia" w:hAnsiTheme="minorHAnsi" w:cstheme="minorBidi"/>
               <w:b w:val="0"/>
               <w:bCs w:val="0"/>
               <w:noProof/>
@@ -1251,13 +1251,13 @@
               <w14:ligatures w14:val="standardContextual"/>
             </w:rPr>
           </w:pPr>
-          <w:hyperlink w:anchor="_Toc216005724" w:history="1">
+          <w:hyperlink w:anchor="_Toc227670209" w:history="1">
             <w:r>
               <w:rPr>
                 <w:rStyle w:val="Hyperlink"/>
                 <w:noProof/>
               </w:rPr>
-              <w:t>DEFECTIVE ITEMS</w:t>
+              <w:t>SITE DETAILS</w:t>
             </w:r>
             <w:r>
               <w:rPr>
@@ -1278,7 +1278,7 @@
                 <w:noProof/>
                 <w:webHidden/>
               </w:rPr>
-              <w:instrText xml:space="preserve"> PAGEREF _Toc216005724 \h </w:instrText>
+              <w:instrText xml:space="preserve"> PAGEREF _Toc227670209 \h </w:instrText>
             </w:r>
             <w:r>
               <w:rPr>
@@ -1298,7 +1298,7 @@
                 <w:noProof/>
                 <w:webHidden/>
               </w:rPr>
-              <w:t>12</w:t>
+              <w:t>15</w:t>
             </w:r>
             <w:r>
               <w:rPr>
@@ -1310,6 +1310,157 @@
           </w:hyperlink>
         </w:p>
         <w:p>
+          <w:pPr>
+            <w:pStyle w:val="TOC1"/>
+            <w:ind w:right="-12" w:firstLine="0"/>
+            <w:rPr>
+              <w:rFonts w:asciiTheme="minorHAnsi" w:eastAsiaTheme="minorEastAsia" w:hAnsiTheme="minorHAnsi" w:cstheme="minorBidi"/>
+              <w:b w:val="0"/>
+              <w:bCs w:val="0"/>
+              <w:noProof/>
+              <w:kern w:val="2"/>
+              <w:sz w:val="24"/>
+              <w:szCs w:val="24"/>
+              <w:lang w:val="en-US" w:eastAsia="en-US"/>
+              <w14:ligatures w14:val="standardContextual"/>
+            </w:rPr>
+          </w:pPr>
+          <w:hyperlink w:anchor="_Toc227670210" w:history="1">
+            <w:r>
+              <w:rPr>
+                <w:rStyle w:val="Hyperlink"/>
+                <w:noProof/>
+              </w:rPr>
+              <w:t>DEFECTIVE ITEMS</w:t>
+            </w:r>
+            <w:r>
+              <w:rPr>
+                <w:noProof/>
+                <w:webHidden/>
+              </w:rPr>
+              <w:tab/>
+            </w:r>
+            <w:r>
+              <w:rPr>
+                <w:noProof/>
+                <w:webHidden/>
+              </w:rPr>
+              <w:fldChar w:fldCharType="begin"/>
+            </w:r>
+            <w:r>
+              <w:rPr>
+                <w:noProof/>
+                <w:webHidden/>
+              </w:rPr>
+              <w:instrText xml:space="preserve"> PAGEREF _Toc227670210 \h </w:instrText>
+            </w:r>
+            <w:r>
+              <w:rPr>
+                <w:noProof/>
+                <w:webHidden/>
+              </w:rPr>
+            </w:r>
+            <w:r>
+              <w:rPr>
+                <w:noProof/>
+                <w:webHidden/>
+              </w:rPr>
+              <w:fldChar w:fldCharType="separate"/>
+            </w:r>
+            <w:r>
+              <w:rPr>
+                <w:noProof/>
+                <w:webHidden/>
+              </w:rPr>
+              <w:t>15</w:t>
+            </w:r>
+            <w:r>
+              <w:rPr>
+                <w:noProof/>
+                <w:webHidden/>
+              </w:rPr>
+              <w:fldChar w:fldCharType="end"/>
+            </w:r>
+          </w:hyperlink>
+        </w:p>
+        <w:p>
+          <w:pPr>
+            <w:pStyle w:val="TOC1"/>
+            <w:ind w:right="-12" w:firstLine="0"/>
+            <w:rPr>
+              <w:rFonts w:asciiTheme="minorHAnsi" w:eastAsiaTheme="minorEastAsia" w:hAnsiTheme="minorHAnsi" w:cstheme="minorBidi"/>
+              <w:b w:val="0"/>
+              <w:bCs w:val="0"/>
+              <w:noProof/>
+              <w:kern w:val="2"/>
+              <w:sz w:val="24"/>
+              <w:szCs w:val="24"/>
+              <w:lang w:val="en-US" w:eastAsia="en-US"/>
+              <w14:ligatures w14:val="standardContextual"/>
+            </w:rPr>
+          </w:pPr>
+          <w:hyperlink w:anchor="_Toc227670211" w:history="1">
+            <w:r>
+              <w:rPr>
+                <w:rStyle w:val="Hyperlink"/>
+                <w:noProof/>
+              </w:rPr>
+              <w:t>SITE IMAGES</w:t>
+            </w:r>
+            <w:r>
+              <w:rPr>
+                <w:noProof/>
+                <w:webHidden/>
+              </w:rPr>
+              <w:tab/>
+            </w:r>
+            <w:r>
+              <w:rPr>
+                <w:noProof/>
+                <w:webHidden/>
+              </w:rPr>
+              <w:fldChar w:fldCharType="begin"/>
+            </w:r>
+            <w:r>
+              <w:rPr>
+                <w:noProof/>
+                <w:webHidden/>
+              </w:rPr>
+              <w:instrText xml:space="preserve"> PAGEREF _Toc227670211 \h </w:instrText>
+            </w:r>
+            <w:r>
+              <w:rPr>
+                <w:noProof/>
+                <w:webHidden/>
+              </w:rPr>
+            </w:r>
+            <w:r>
+              <w:rPr>
+                <w:noProof/>
+                <w:webHidden/>
+              </w:rPr>
+              <w:fldChar w:fldCharType="separate"/>
+            </w:r>
+            <w:r>
+              <w:rPr>
+                <w:noProof/>
+                <w:webHidden/>
+              </w:rPr>
+              <w:t>15</w:t>
+            </w:r>
+            <w:r>
+              <w:rPr>
+                <w:noProof/>
+                <w:webHidden/>
+              </w:rPr>
+              <w:fldChar w:fldCharType="end"/>
+            </w:r>
+          </w:hyperlink>
+        </w:p>
+        <w:p>
+          <w:pPr>
+            <w:ind w:right="-12"/>
+          </w:pPr>
           <w:r>
             <w:rPr>
               <w:b/>
@@ -1360,7 +1511,7 @@
       </w:pPr>
       <w:bookmarkStart w:id="0" w:name="_heading=h.gjdgxs" w:colFirst="0" w:colLast="0"/>
       <w:bookmarkStart w:id="1" w:name="_Toc215868110"/>
-      <w:bookmarkStart w:id="2" w:name="_Toc216005715"/>
+      <w:bookmarkStart w:id="2" w:name="_Toc227670200"/>
       <w:bookmarkEnd w:id="0"/>
       <w:r>
         <w:rPr>
@@ -1439,12 +1590,26 @@
           <w:rFonts w:eastAsia="Arial"/>
           <w:color w:val="000000" w:themeColor="text1"/>
         </w:rPr>
-        <w:t xml:space="preserve">CMG Elevator Management (CMG) were engaged by </w:t>
-      </w:r>
-      <w:r>
-        <w:rPr>
+        <w:t xml:space="preserve">CMG Elevator Management (CMG) </w:t>
+      </w:r>
+      <w:r>
+        <w:rPr>
+          <w:rFonts w:eastAsia="Arial"/>
           <w:color w:val="000000" w:themeColor="text1"/>
         </w:rPr>
+        <w:t>was</w:t>
+      </w:r>
+      <w:r>
+        <w:rPr>
+          <w:rFonts w:eastAsia="Arial"/>
+          <w:color w:val="000000" w:themeColor="text1"/>
+        </w:rPr>
+        <w:t xml:space="preserve"> engaged by </w:t>
+      </w:r>
+      <w:r>
+        <w:rPr>
+          <w:color w:val="000000" w:themeColor="text1"/>
+        </w:rPr>
         <w:t>{{</w:t>
       </w:r>
       <w:r>
@@ -1464,7 +1629,21 @@
           <w:rFonts w:eastAsia="Arial"/>
           <w:color w:val="000000" w:themeColor="text1"/>
         </w:rPr>
-        <w:t xml:space="preserve"> to conduct an inspection and provide a report of the vertical transportation equipment for </w:t>
+        <w:t xml:space="preserve"> to conduct an inspection and provide a report o</w:t>
+      </w:r>
+      <w:r>
+        <w:rPr>
+          <w:rFonts w:eastAsia="Arial"/>
+          <w:color w:val="000000" w:themeColor="text1"/>
+        </w:rPr>
+        <w:t>n</w:t>
+      </w:r>
+      <w:r>
+        <w:rPr>
+          <w:rFonts w:eastAsia="Arial"/>
+          <w:color w:val="000000" w:themeColor="text1"/>
+        </w:rPr>
+        <w:t xml:space="preserve"> the vertical transportation equipment for </w:t>
       </w:r>
       <w:r>
         <w:rPr>
@@ -3424,27 +3603,7 @@
           <w:bCs/>
           <w:color w:val="EE0000"/>
         </w:rPr>
-        <w:t xml:space="preserve">no major obsolescence risks / minor obsolescence risk / significant </w:t>
-      </w:r>
-      <w:proofErr w:type="spellStart"/>
-      <w:r>
-        <w:rPr>
-          <w:rFonts w:eastAsia="Arial"/>
-          <w:b/>
-          <w:bCs/>
-          <w:color w:val="EE0000"/>
-        </w:rPr>
-        <w:t>obsdolescence</w:t>
-      </w:r>
-      <w:proofErr w:type="spellEnd"/>
-      <w:r>
-        <w:rPr>
-          <w:rFonts w:eastAsia="Arial"/>
-          <w:b/>
-          <w:bCs/>
-          <w:color w:val="EE0000"/>
-        </w:rPr>
-        <w:t xml:space="preserve"> risk with the main control equipment, doors, landing buttons, car buttons or indicators</w:t>
+        <w:t>no major obsolescence risks / minor obsolescence risk / significant obsdolescence risk with the main control equipment, doors, landing buttons, car buttons or indicators</w:t>
       </w:r>
       <w:r>
         <w:rPr>
@@ -3490,7 +3649,21 @@
           <w:rFonts w:eastAsia="Calibri"/>
           <w:color w:val="000000" w:themeColor="text1"/>
         </w:rPr>
-        <w:t>Beyond code compliance at the time of installation, we have assessed the installed equipment for further risk with compliance with the latest codes, National Work Health and Safety (WH&amp;S) Act 2011 and corresponding Regulation. There are several items that require attention, these would be included within any upgrade scope to further protect the owners, users and maintenance contractors.</w:t>
+        <w:t xml:space="preserve">Beyond code compliance at the time of installation, we have assessed the installed equipment for further risk with compliance with the latest codes, National Work Health and Safety (WH&amp;S) Act 2011 and corresponding </w:t>
+      </w:r>
+      <w:r>
+        <w:rPr>
+          <w:rFonts w:eastAsia="Calibri"/>
+          <w:color w:val="000000" w:themeColor="text1"/>
+        </w:rPr>
+        <w:t>r</w:t>
+      </w:r>
+      <w:r>
+        <w:rPr>
+          <w:rFonts w:eastAsia="Calibri"/>
+          <w:color w:val="000000" w:themeColor="text1"/>
+        </w:rPr>
+        <w:t>egulation. There are several items that require attention, these would be included within any upgrade scope to further protect the owners, users and maintenance contractors.</w:t>
       </w:r>
     </w:p>
     <w:p>
@@ -3545,6 +3718,13 @@
         </w:rPr>
         <w:t>.</w:t>
       </w:r>
+      <w:r>
+        <w:rPr>
+          <w:rFonts w:eastAsia="Arial"/>
+          <w:color w:val="000000"/>
+        </w:rPr>
+        <w:t xml:space="preserve"> Further details are provided in the recommendations section of this report.</w:t>
+      </w:r>
     </w:p>
     <w:p>
       <w:pPr>
@@ -3615,7 +3795,7 @@
         <w:t xml:space="preserve"> </w:t>
       </w:r>
       <w:bookmarkStart w:id="3" w:name="_Toc215868111"/>
-      <w:bookmarkStart w:id="4" w:name="_Toc216005716"/>
+      <w:bookmarkStart w:id="4" w:name="_Toc227670201"/>
       <w:r>
         <w:rPr>
           <w:i w:val="0"/>
@@ -3709,7 +3889,7 @@
           <w:rFonts w:eastAsia="Arial"/>
           <w:color w:val="000000"/>
         </w:rPr>
-        <w:t xml:space="preserve">in our opinion, is considered to be of an </w:t>
+        <w:t xml:space="preserve">in our opinion, is of an </w:t>
       </w:r>
       <w:r>
         <w:rPr>
@@ -3861,7 +4041,31 @@
         <w:rPr>
           <w:rFonts w:eastAsia="Arial"/>
         </w:rPr>
-        <w:t>Additional to the noted items above, the following items require the attention of Building Management:</w:t>
+        <w:t xml:space="preserve">Additional to the noted items above, the following items require the attention of </w:t>
+      </w:r>
+      <w:r>
+        <w:rPr>
+          <w:rFonts w:eastAsia="Arial"/>
+        </w:rPr>
+        <w:t>b</w:t>
+      </w:r>
+      <w:r>
+        <w:rPr>
+          <w:rFonts w:eastAsia="Arial"/>
+        </w:rPr>
+        <w:t xml:space="preserve">uilding </w:t>
+      </w:r>
+      <w:r>
+        <w:rPr>
+          <w:rFonts w:eastAsia="Arial"/>
+        </w:rPr>
+        <w:t>m</w:t>
+      </w:r>
+      <w:r>
+        <w:rPr>
+          <w:rFonts w:eastAsia="Arial"/>
+        </w:rPr>
+        <w:t>anagement:</w:t>
       </w:r>
     </w:p>
     <w:p>
@@ -3955,7 +4159,7 @@
       </w:pPr>
       <w:bookmarkStart w:id="5" w:name="_heading=h.30j0zll" w:colFirst="0" w:colLast="0"/>
       <w:bookmarkStart w:id="6" w:name="_Toc215868112"/>
-      <w:bookmarkStart w:id="7" w:name="_Toc216005717"/>
+      <w:bookmarkStart w:id="7" w:name="_Toc227670202"/>
       <w:bookmarkEnd w:id="5"/>
       <w:r>
         <w:rPr>
@@ -4011,7 +4215,7 @@
           <w:rFonts w:eastAsia="Arial"/>
           <w:color w:val="000000"/>
         </w:rPr>
-        <w:t>All of the</w:t>
+        <w:t>All the</w:t>
       </w:r>
       <w:r>
         <w:rPr>
@@ -4376,7 +4580,7 @@
         </w:rPr>
       </w:pPr>
       <w:bookmarkStart w:id="8" w:name="_Toc215868113"/>
-      <w:bookmarkStart w:id="9" w:name="_Toc216005718"/>
+      <w:bookmarkStart w:id="9" w:name="_Toc227670203"/>
       <w:r>
         <w:rPr>
           <w:i w:val="0"/>
@@ -4432,7 +4636,21 @@
           <w:rFonts w:eastAsia="Arial"/>
           <w:color w:val="000000"/>
         </w:rPr>
-        <w:t>The identification of items that present significant risk to the availability of the equipment have been reviewed in our inspection. When conducting the inspection we reviewed items that are likely to cause ongoing reliability issues and items that may lead to lengthy outage times. The main contributors to these are component wear / fatigue, spare part availability, obsolescence and major repairs requiring additional labour.</w:t>
+        <w:t>The identification of items that present significant risk to the availability of the equipment have been reviewed in our inspection. When conducting the inspection</w:t>
+      </w:r>
+      <w:r>
+        <w:rPr>
+          <w:rFonts w:eastAsia="Arial"/>
+          <w:color w:val="000000"/>
+        </w:rPr>
+        <w:t>,</w:t>
+      </w:r>
+      <w:r>
+        <w:rPr>
+          <w:rFonts w:eastAsia="Arial"/>
+          <w:color w:val="000000"/>
+        </w:rPr>
+        <w:t xml:space="preserve"> we reviewed items that are likely to cause ongoing reliability issues and items that may lead to lengthy outage times. The main contributors to these are component wear / fatigue, spare part availability, obsolescence and major repairs requiring additional labour.</w:t>
       </w:r>
     </w:p>
     <w:p>
@@ -4457,7 +4675,49 @@
           <w:rFonts w:eastAsia="Arial"/>
           <w:color w:val="000000"/>
         </w:rPr>
-        <w:t xml:space="preserve">The items identified under this Reliability and Outage Risk category are noted below. </w:t>
+        <w:t xml:space="preserve">The items identified under this </w:t>
+      </w:r>
+      <w:r>
+        <w:rPr>
+          <w:rFonts w:eastAsia="Arial"/>
+          <w:color w:val="000000"/>
+        </w:rPr>
+        <w:t>r</w:t>
+      </w:r>
+      <w:r>
+        <w:rPr>
+          <w:rFonts w:eastAsia="Arial"/>
+          <w:color w:val="000000"/>
+        </w:rPr>
+        <w:t xml:space="preserve">eliability and </w:t>
+      </w:r>
+      <w:r>
+        <w:rPr>
+          <w:rFonts w:eastAsia="Arial"/>
+          <w:color w:val="000000"/>
+        </w:rPr>
+        <w:t>o</w:t>
+      </w:r>
+      <w:r>
+        <w:rPr>
+          <w:rFonts w:eastAsia="Arial"/>
+          <w:color w:val="000000"/>
+        </w:rPr>
+        <w:t xml:space="preserve">utage </w:t>
+      </w:r>
+      <w:r>
+        <w:rPr>
+          <w:rFonts w:eastAsia="Arial"/>
+          <w:color w:val="000000"/>
+        </w:rPr>
+        <w:t>r</w:t>
+      </w:r>
+      <w:r>
+        <w:rPr>
+          <w:rFonts w:eastAsia="Arial"/>
+          <w:color w:val="000000"/>
+        </w:rPr>
+        <w:t xml:space="preserve">isk category are noted below. </w:t>
       </w:r>
     </w:p>
     <w:p>
@@ -4616,7 +4876,31 @@
         <w:rPr>
           <w:rFonts w:eastAsia="Arial"/>
         </w:rPr>
-        <w:t>Additional to the noted items above, the following items require the attention of Building Management:</w:t>
+        <w:t xml:space="preserve">Additional to the noted items above, the following items require the attention of </w:t>
+      </w:r>
+      <w:r>
+        <w:rPr>
+          <w:rFonts w:eastAsia="Arial"/>
+        </w:rPr>
+        <w:t>b</w:t>
+      </w:r>
+      <w:r>
+        <w:rPr>
+          <w:rFonts w:eastAsia="Arial"/>
+        </w:rPr>
+        <w:t xml:space="preserve">uilding </w:t>
+      </w:r>
+      <w:r>
+        <w:rPr>
+          <w:rFonts w:eastAsia="Arial"/>
+        </w:rPr>
+        <w:t>m</w:t>
+      </w:r>
+      <w:r>
+        <w:rPr>
+          <w:rFonts w:eastAsia="Arial"/>
+        </w:rPr>
+        <w:t>anagement:</w:t>
       </w:r>
     </w:p>
     <w:p>
@@ -4668,7 +4952,7 @@
         </w:rPr>
       </w:pPr>
       <w:bookmarkStart w:id="10" w:name="_Toc215868114"/>
-      <w:bookmarkStart w:id="11" w:name="_Toc216005719"/>
+      <w:bookmarkStart w:id="11" w:name="_Toc227670204"/>
       <w:r>
         <w:rPr>
           <w:i w:val="0"/>
@@ -4766,7 +5050,35 @@
           <w:rFonts w:eastAsia="Arial"/>
           <w:color w:val="000000"/>
         </w:rPr>
-        <w:t xml:space="preserve">The current maintenance Agreement specifies the following Maintenance frequencies: </w:t>
+        <w:t xml:space="preserve">The current maintenance </w:t>
+      </w:r>
+      <w:r>
+        <w:rPr>
+          <w:rFonts w:eastAsia="Arial"/>
+          <w:color w:val="000000"/>
+        </w:rPr>
+        <w:t>a</w:t>
+      </w:r>
+      <w:r>
+        <w:rPr>
+          <w:rFonts w:eastAsia="Arial"/>
+          <w:color w:val="000000"/>
+        </w:rPr>
+        <w:t xml:space="preserve">greement specifies the following </w:t>
+      </w:r>
+      <w:r>
+        <w:rPr>
+          <w:rFonts w:eastAsia="Arial"/>
+          <w:color w:val="000000"/>
+        </w:rPr>
+        <w:t>m</w:t>
+      </w:r>
+      <w:r>
+        <w:rPr>
+          <w:rFonts w:eastAsia="Arial"/>
+          <w:color w:val="000000"/>
+        </w:rPr>
+        <w:t xml:space="preserve">aintenance frequencies: </w:t>
       </w:r>
     </w:p>
     <w:p>
@@ -4856,22 +5168,7 @@
           <w:color w:val="FF0000"/>
         </w:rPr>
         <w:tab/>
-      </w:r>
-      <w:proofErr w:type="spellStart"/>
-      <w:r>
-        <w:rPr>
-          <w:rFonts w:eastAsia="Arial"/>
-          <w:color w:val="FF0000"/>
-        </w:rPr>
-        <w:t>Xxxxxxxx</w:t>
-      </w:r>
-      <w:proofErr w:type="spellEnd"/>
-      <w:r>
-        <w:rPr>
-          <w:rFonts w:eastAsia="Arial"/>
-          <w:color w:val="FF0000"/>
-        </w:rPr>
-        <w:t xml:space="preserve"> (4)</w:t>
+        <w:t>Xxxxxxxx (4)</w:t>
       </w:r>
     </w:p>
     <w:p>
@@ -5449,16 +5746,16 @@
           <w:sz w:val="22"/>
           <w:szCs w:val="22"/>
         </w:rPr>
-        <w:t xml:space="preserve">, with the following analysis based solely upon the records provided by the </w:t>
+        <w:t>, with the following analysis based solely upon the</w:t>
       </w:r>
       <w:r>
         <w:rPr>
           <w:rFonts w:eastAsia="Calibri"/>
-          <w:color w:val="FF0000"/>
+          <w:color w:val="000000"/>
           <w:sz w:val="22"/>
           <w:szCs w:val="22"/>
         </w:rPr>
-        <w:t>Contractor</w:t>
+        <w:t>se records</w:t>
       </w:r>
       <w:r>
         <w:rPr>
@@ -5578,7 +5875,7 @@
           <w:rFonts w:eastAsia="Arial"/>
           <w:color w:val="000000"/>
         </w:rPr>
-        <w:t xml:space="preserve">, which averages at approximately </w:t>
+        <w:t xml:space="preserve">, which averages at </w:t>
       </w:r>
       <w:r>
         <w:rPr>
@@ -5606,7 +5903,21 @@
           <w:rFonts w:eastAsia="Arial"/>
           <w:color w:val="000000"/>
         </w:rPr>
-        <w:t xml:space="preserve">per annum. This is considered to be an </w:t>
+        <w:t xml:space="preserve">per annum. This </w:t>
+      </w:r>
+      <w:r>
+        <w:rPr>
+          <w:rFonts w:eastAsia="Arial"/>
+          <w:color w:val="000000"/>
+        </w:rPr>
+        <w:t>is</w:t>
+      </w:r>
+      <w:r>
+        <w:rPr>
+          <w:rFonts w:eastAsia="Arial"/>
+          <w:color w:val="000000"/>
+        </w:rPr>
+        <w:t xml:space="preserve"> an </w:t>
       </w:r>
       <w:r>
         <w:rPr>
@@ -5757,7 +6068,119 @@
           <w:rFonts w:eastAsia="Arial"/>
           <w:color w:val="FF0000"/>
         </w:rPr>
-        <w:t>Landing doors/ Signalisation (Buttons and Indicators)  / Controller and Drive / shaft equipment / pit equipment / Step band / Handrail system</w:t>
+        <w:t>l</w:t>
+      </w:r>
+      <w:r>
+        <w:rPr>
+          <w:rFonts w:eastAsia="Arial"/>
+          <w:color w:val="FF0000"/>
+        </w:rPr>
+        <w:t xml:space="preserve">anding doors/ </w:t>
+      </w:r>
+      <w:r>
+        <w:rPr>
+          <w:rFonts w:eastAsia="Arial"/>
+          <w:color w:val="FF0000"/>
+        </w:rPr>
+        <w:t>s</w:t>
+      </w:r>
+      <w:r>
+        <w:rPr>
+          <w:rFonts w:eastAsia="Arial"/>
+          <w:color w:val="FF0000"/>
+        </w:rPr>
+        <w:t>ignalisation (</w:t>
+      </w:r>
+      <w:r>
+        <w:rPr>
+          <w:rFonts w:eastAsia="Arial"/>
+          <w:color w:val="FF0000"/>
+        </w:rPr>
+        <w:t>b</w:t>
+      </w:r>
+      <w:r>
+        <w:rPr>
+          <w:rFonts w:eastAsia="Arial"/>
+          <w:color w:val="FF0000"/>
+        </w:rPr>
+        <w:t xml:space="preserve">uttons and </w:t>
+      </w:r>
+      <w:r>
+        <w:rPr>
+          <w:rFonts w:eastAsia="Arial"/>
+          <w:color w:val="FF0000"/>
+        </w:rPr>
+        <w:t>i</w:t>
+      </w:r>
+      <w:r>
+        <w:rPr>
+          <w:rFonts w:eastAsia="Arial"/>
+          <w:color w:val="FF0000"/>
+        </w:rPr>
+        <w:t>ndicators) /</w:t>
+      </w:r>
+      <w:r>
+        <w:rPr>
+          <w:rFonts w:eastAsia="Arial"/>
+          <w:color w:val="FF0000"/>
+        </w:rPr>
+        <w:t xml:space="preserve"> </w:t>
+      </w:r>
+      <w:r>
+        <w:rPr>
+          <w:rFonts w:eastAsia="Arial"/>
+          <w:color w:val="FF0000"/>
+        </w:rPr>
+        <w:t>c</w:t>
+      </w:r>
+      <w:r>
+        <w:rPr>
+          <w:rFonts w:eastAsia="Arial"/>
+          <w:color w:val="FF0000"/>
+        </w:rPr>
+        <w:t xml:space="preserve">ontroller and </w:t>
+      </w:r>
+      <w:r>
+        <w:rPr>
+          <w:rFonts w:eastAsia="Arial"/>
+          <w:color w:val="FF0000"/>
+        </w:rPr>
+        <w:t>d</w:t>
+      </w:r>
+      <w:r>
+        <w:rPr>
+          <w:rFonts w:eastAsia="Arial"/>
+          <w:color w:val="FF0000"/>
+        </w:rPr>
+        <w:t xml:space="preserve">rive / shaft equipment / pit equipment / </w:t>
+      </w:r>
+      <w:r>
+        <w:rPr>
+          <w:rFonts w:eastAsia="Arial"/>
+          <w:color w:val="FF0000"/>
+        </w:rPr>
+        <w:t>s</w:t>
+      </w:r>
+      <w:r>
+        <w:rPr>
+          <w:rFonts w:eastAsia="Arial"/>
+          <w:color w:val="FF0000"/>
+        </w:rPr>
+        <w:t xml:space="preserve">tep band / </w:t>
+      </w:r>
+      <w:r>
+        <w:rPr>
+          <w:rFonts w:eastAsia="Arial"/>
+          <w:color w:val="FF0000"/>
+        </w:rPr>
+        <w:t>h</w:t>
+      </w:r>
+      <w:r>
+        <w:rPr>
+          <w:rFonts w:eastAsia="Arial"/>
+          <w:color w:val="FF0000"/>
+        </w:rPr>
+        <w:t>andrail system</w:t>
       </w:r>
       <w:r>
         <w:rPr>
@@ -5789,7 +6212,6 @@
           <w:rFonts w:eastAsia="Arial"/>
           <w:color w:val="000000"/>
         </w:rPr>
-        <w:lastRenderedPageBreak/>
         <w:t xml:space="preserve">In summary, reliability is expected to </w:t>
       </w:r>
       <w:r>
@@ -5797,21 +6219,35 @@
           <w:rFonts w:eastAsia="Arial"/>
           <w:color w:val="FF0000"/>
         </w:rPr>
-        <w:t xml:space="preserve">decline / remain unchanged / improve </w:t>
-      </w:r>
-      <w:r>
-        <w:rPr>
-          <w:rFonts w:eastAsia="Arial"/>
-          <w:color w:val="000000"/>
-        </w:rPr>
-        <w:t xml:space="preserve">, based on  </w:t>
+        <w:t xml:space="preserve">decline / remain unchanged / </w:t>
       </w:r>
       <w:r>
         <w:rPr>
           <w:rFonts w:eastAsia="Arial"/>
           <w:color w:val="FF0000"/>
         </w:rPr>
-        <w:t>Passenger usage, current maintenance provided, equipment age, parts availability</w:t>
+        <w:t>improve,</w:t>
+      </w:r>
+      <w:r>
+        <w:rPr>
+          <w:rFonts w:eastAsia="Arial"/>
+          <w:color w:val="000000"/>
+        </w:rPr>
+        <w:t xml:space="preserve"> based </w:t>
+      </w:r>
+      <w:r>
+        <w:rPr>
+          <w:rFonts w:eastAsia="Arial"/>
+          <w:color w:val="000000"/>
+        </w:rPr>
+        <w:t>on Passenger</w:t>
+      </w:r>
+      <w:r>
+        <w:rPr>
+          <w:rFonts w:eastAsia="Arial"/>
+          <w:color w:val="FF0000"/>
+        </w:rPr>
+        <w:t xml:space="preserve"> usage, current maintenance provided, equipment age, parts availability</w:t>
       </w:r>
       <w:r>
         <w:rPr>
@@ -6102,7 +6538,7 @@
         </w:rPr>
       </w:pPr>
       <w:bookmarkStart w:id="12" w:name="_Toc215868115"/>
-      <w:bookmarkStart w:id="13" w:name="_Toc216005720"/>
+      <w:bookmarkStart w:id="13" w:name="_Toc227670205"/>
       <w:r>
         <w:rPr>
           <w:i w:val="0"/>
@@ -6187,14 +6623,56 @@
           <w:rFonts w:eastAsia="Arial"/>
           <w:color w:val="000000"/>
         </w:rPr>
-        <w:t xml:space="preserve">Performance parameters of the elevators were measured and the results of these measurements were compared with </w:t>
+        <w:t xml:space="preserve">Performance parameters of the </w:t>
+      </w:r>
+      <w:r>
+        <w:rPr>
+          <w:rFonts w:eastAsia="Arial"/>
+          <w:color w:val="000000"/>
+        </w:rPr>
+        <w:t>equipment</w:t>
+      </w:r>
+      <w:r>
+        <w:rPr>
+          <w:rFonts w:eastAsia="Arial"/>
+          <w:color w:val="000000"/>
+        </w:rPr>
+        <w:t xml:space="preserve"> were </w:t>
+      </w:r>
+      <w:r>
+        <w:rPr>
+          <w:rFonts w:eastAsia="Arial"/>
+          <w:color w:val="000000"/>
+        </w:rPr>
+        <w:t>measured,</w:t>
+      </w:r>
+      <w:r>
+        <w:rPr>
+          <w:rFonts w:eastAsia="Arial"/>
+          <w:color w:val="000000"/>
+        </w:rPr>
+        <w:t xml:space="preserve"> and the results were compared with </w:t>
       </w:r>
       <w:r>
         <w:rPr>
           <w:rFonts w:eastAsia="Arial"/>
           <w:color w:val="FF0000"/>
         </w:rPr>
-        <w:t>the values specified in the Comprehensive Maintenance Contract / Industry standard.</w:t>
+        <w:t xml:space="preserve">the values specified in the Comprehensive Maintenance Contract / </w:t>
+      </w:r>
+      <w:r>
+        <w:rPr>
+          <w:rFonts w:eastAsia="Arial"/>
+          <w:color w:val="FF0000"/>
+        </w:rPr>
+        <w:t>i</w:t>
+      </w:r>
+      <w:r>
+        <w:rPr>
+          <w:rFonts w:eastAsia="Arial"/>
+          <w:color w:val="FF0000"/>
+        </w:rPr>
+        <w:t>ndustry standard.</w:t>
       </w:r>
     </w:p>
     <w:p>
@@ -6250,7 +6728,21 @@
           <w:rFonts w:eastAsia="Arial"/>
           <w:color w:val="000000"/>
         </w:rPr>
-        <w:t>The parameters needing attention are as follows:</w:t>
+        <w:t xml:space="preserve">The </w:t>
+      </w:r>
+      <w:r>
+        <w:rPr>
+          <w:rFonts w:eastAsia="Arial"/>
+          <w:color w:val="000000"/>
+        </w:rPr>
+        <w:t>items</w:t>
+      </w:r>
+      <w:r>
+        <w:rPr>
+          <w:rFonts w:eastAsia="Arial"/>
+          <w:color w:val="000000"/>
+        </w:rPr>
+        <w:t xml:space="preserve"> needing attention are as follows:</w:t>
       </w:r>
     </w:p>
     <w:p>
@@ -6825,6 +7317,14 @@
           <w:b/>
           <w:color w:val="000000"/>
         </w:rPr>
+        <w:t xml:space="preserve">Passenger </w:t>
+      </w:r>
+      <w:r>
+        <w:rPr>
+          <w:rFonts w:eastAsia="Arial"/>
+          <w:b/>
+          <w:color w:val="000000"/>
+        </w:rPr>
         <w:t xml:space="preserve">Safety and Security </w:t>
       </w:r>
     </w:p>
@@ -6850,23 +7350,7 @@
           <w:rFonts w:eastAsia="Arial"/>
           <w:color w:val="000000"/>
         </w:rPr>
-        <w:t xml:space="preserve">At CMG Elevator Management Safety forms one of our foundational pillars. The safety and </w:t>
-      </w:r>
-      <w:proofErr w:type="spellStart"/>
-      <w:r>
-        <w:rPr>
-          <w:rFonts w:eastAsia="Arial"/>
-          <w:color w:val="000000"/>
-        </w:rPr>
-        <w:t>well being</w:t>
-      </w:r>
-      <w:proofErr w:type="spellEnd"/>
-      <w:r>
-        <w:rPr>
-          <w:rFonts w:eastAsia="Arial"/>
-          <w:color w:val="000000"/>
-        </w:rPr>
-        <w:t xml:space="preserve"> of passengers whilst travelling within the elevator must be considered in any inspection. During our inspection we tested the following items to ensure all passengers are safe whilst journeying through your building:</w:t>
+        <w:t>At CMG Elevator Management Safety forms one of our foundational pillars. The safety and well being of passengers whilst travelling within the elevator must be considered in any inspection. During our inspection we tested the following items to ensure all passengers are safe whilst journeying through your building:</w:t>
       </w:r>
     </w:p>
     <w:p>
@@ -6905,7 +7389,21 @@
           <w:rFonts w:eastAsia="Arial"/>
           <w:color w:val="000000"/>
         </w:rPr>
-        <w:t xml:space="preserve"> Lux during normal power conditions, this </w:t>
+        <w:t xml:space="preserve"> </w:t>
+      </w:r>
+      <w:r>
+        <w:rPr>
+          <w:rFonts w:eastAsia="Arial"/>
+          <w:color w:val="000000"/>
+        </w:rPr>
+        <w:t>l</w:t>
+      </w:r>
+      <w:r>
+        <w:rPr>
+          <w:rFonts w:eastAsia="Arial"/>
+          <w:color w:val="000000"/>
+        </w:rPr>
+        <w:t xml:space="preserve">ux during normal power conditions, this </w:t>
       </w:r>
       <w:r>
         <w:rPr>
@@ -6919,21 +7417,49 @@
           <w:rFonts w:eastAsia="Arial"/>
           <w:color w:val="000000"/>
         </w:rPr>
-        <w:t xml:space="preserve">the minimum required Lux level of </w:t>
+        <w:t xml:space="preserve">the minimum required </w:t>
+      </w:r>
+      <w:r>
+        <w:rPr>
+          <w:rFonts w:eastAsia="Arial"/>
+          <w:color w:val="000000"/>
+        </w:rPr>
+        <w:t>l</w:t>
+      </w:r>
+      <w:r>
+        <w:rPr>
+          <w:rFonts w:eastAsia="Arial"/>
+          <w:color w:val="000000"/>
+        </w:rPr>
+        <w:t>ux level of</w:t>
+      </w:r>
+      <w:r>
+        <w:rPr>
+          <w:rFonts w:eastAsia="Arial"/>
+          <w:color w:val="000000"/>
+        </w:rPr>
+        <w:t xml:space="preserve"> 100</w:t>
       </w:r>
       <w:r>
         <w:rPr>
           <w:rFonts w:eastAsia="Arial"/>
           <w:color w:val="FF0000"/>
         </w:rPr>
-        <w:t>XX</w:t>
-      </w:r>
-      <w:r>
-        <w:rPr>
-          <w:rFonts w:eastAsia="Arial"/>
-          <w:color w:val="000000"/>
-        </w:rPr>
-        <w:t xml:space="preserve"> Lux. </w:t>
+        <w:t xml:space="preserve"> </w:t>
+      </w:r>
+      <w:r>
+        <w:rPr>
+          <w:rFonts w:eastAsia="Arial"/>
+          <w:color w:val="000000"/>
+        </w:rPr>
+        <w:t>l</w:t>
+      </w:r>
+      <w:r>
+        <w:rPr>
+          <w:rFonts w:eastAsia="Arial"/>
+          <w:color w:val="000000"/>
+        </w:rPr>
+        <w:t xml:space="preserve">ux. </w:t>
       </w:r>
     </w:p>
     <w:p>
@@ -6973,7 +7499,21 @@
           <w:rFonts w:eastAsia="Arial"/>
           <w:color w:val="000000"/>
         </w:rPr>
-        <w:t xml:space="preserve"> Lux during emergency power conditions, this </w:t>
+        <w:t xml:space="preserve"> </w:t>
+      </w:r>
+      <w:r>
+        <w:rPr>
+          <w:rFonts w:eastAsia="Arial"/>
+          <w:color w:val="000000"/>
+        </w:rPr>
+        <w:t>l</w:t>
+      </w:r>
+      <w:r>
+        <w:rPr>
+          <w:rFonts w:eastAsia="Arial"/>
+          <w:color w:val="000000"/>
+        </w:rPr>
+        <w:t xml:space="preserve">ux during emergency power conditions, this </w:t>
       </w:r>
       <w:r>
         <w:rPr>
@@ -6987,21 +7527,49 @@
           <w:rFonts w:eastAsia="Arial"/>
           <w:color w:val="000000"/>
         </w:rPr>
-        <w:t xml:space="preserve">the required Lux level of </w:t>
-      </w:r>
-      <w:r>
-        <w:rPr>
-          <w:rFonts w:eastAsia="Arial"/>
-          <w:color w:val="FF0000"/>
-        </w:rPr>
-        <w:t>XX</w:t>
-      </w:r>
-      <w:r>
-        <w:rPr>
-          <w:rFonts w:eastAsia="Arial"/>
-          <w:color w:val="000000"/>
-        </w:rPr>
-        <w:t xml:space="preserve"> Lux. </w:t>
+        <w:t xml:space="preserve">the required </w:t>
+      </w:r>
+      <w:r>
+        <w:rPr>
+          <w:rFonts w:eastAsia="Arial"/>
+          <w:color w:val="000000"/>
+        </w:rPr>
+        <w:t>l</w:t>
+      </w:r>
+      <w:r>
+        <w:rPr>
+          <w:rFonts w:eastAsia="Arial"/>
+          <w:color w:val="000000"/>
+        </w:rPr>
+        <w:t>ux level of</w:t>
+      </w:r>
+      <w:r>
+        <w:rPr>
+          <w:rFonts w:eastAsia="Arial"/>
+          <w:color w:val="000000"/>
+        </w:rPr>
+        <w:t xml:space="preserve"> 5</w:t>
+      </w:r>
+      <w:r>
+        <w:rPr>
+          <w:rFonts w:eastAsia="Arial"/>
+          <w:color w:val="000000"/>
+        </w:rPr>
+        <w:t xml:space="preserve"> </w:t>
+      </w:r>
+      <w:r>
+        <w:rPr>
+          <w:rFonts w:eastAsia="Arial"/>
+          <w:color w:val="000000"/>
+        </w:rPr>
+        <w:t>l</w:t>
+      </w:r>
+      <w:r>
+        <w:rPr>
+          <w:rFonts w:eastAsia="Arial"/>
+          <w:color w:val="000000"/>
+        </w:rPr>
+        <w:t xml:space="preserve">ux. </w:t>
       </w:r>
     </w:p>
     <w:p>
@@ -7161,7 +7729,21 @@
           <w:rFonts w:eastAsia="Arial"/>
           <w:color w:val="000000"/>
         </w:rPr>
-        <w:t xml:space="preserve">levator alarm and 2 way voice communication </w:t>
+        <w:t xml:space="preserve">levator alarm and </w:t>
+      </w:r>
+      <w:r>
+        <w:rPr>
+          <w:rFonts w:eastAsia="Arial"/>
+          <w:color w:val="000000"/>
+        </w:rPr>
+        <w:t>2-way</w:t>
+      </w:r>
+      <w:r>
+        <w:rPr>
+          <w:rFonts w:eastAsia="Arial"/>
+          <w:color w:val="000000"/>
+        </w:rPr>
+        <w:t xml:space="preserve"> voice communication </w:t>
       </w:r>
       <w:r>
         <w:t>were</w:t>
@@ -7185,14 +7767,28 @@
           <w:rFonts w:eastAsia="Arial"/>
           <w:color w:val="000000"/>
         </w:rPr>
-        <w:t xml:space="preserve">The 2 way communication is </w:t>
+        <w:t xml:space="preserve">The </w:t>
+      </w:r>
+      <w:r>
+        <w:rPr>
+          <w:rFonts w:eastAsia="Arial"/>
+          <w:color w:val="000000"/>
+        </w:rPr>
+        <w:t>2-way</w:t>
+      </w:r>
+      <w:r>
+        <w:rPr>
+          <w:rFonts w:eastAsia="Arial"/>
+          <w:color w:val="000000"/>
+        </w:rPr>
+        <w:t xml:space="preserve"> communication is </w:t>
       </w:r>
       <w:r>
         <w:rPr>
           <w:rFonts w:eastAsia="Arial"/>
           <w:color w:val="FF0000"/>
         </w:rPr>
-        <w:t xml:space="preserve">GSM (3G / 4G) / </w:t>
+        <w:t xml:space="preserve">GSM (4G) / </w:t>
       </w:r>
       <w:r>
         <w:rPr>
@@ -7348,7 +7944,21 @@
           <w:rFonts w:eastAsia="Arial"/>
           <w:color w:val="000000"/>
         </w:rPr>
-        <w:t>The Passenger door protection device is designed to prevent the doors from closing on passengers as they enter and depart the elevator car. The installed detector type is</w:t>
+        <w:t xml:space="preserve">The </w:t>
+      </w:r>
+      <w:r>
+        <w:rPr>
+          <w:rFonts w:eastAsia="Arial"/>
+          <w:color w:val="000000"/>
+        </w:rPr>
+        <w:t>p</w:t>
+      </w:r>
+      <w:r>
+        <w:rPr>
+          <w:rFonts w:eastAsia="Arial"/>
+          <w:color w:val="000000"/>
+        </w:rPr>
+        <w:t>assenger door protection device is designed to prevent the doors from closing on passengers as they enter and depart the elevator car. The installed detector type is</w:t>
       </w:r>
       <w:r>
         <w:rPr>
@@ -7683,13 +8293,13 @@
       </w:r>
       <w:r>
         <w:rPr>
-          <w:rFonts w:eastAsia="Noto Sans Symbols"/>
           <w:b/>
-          <w:color w:val="000000"/>
+          <w:bCs/>
+          <w:color w:val="FF0000"/>
           <w:sz w:val="18"/>
           <w:szCs w:val="18"/>
         </w:rPr>
-        <w:t>🞪</w:t>
+        <w:t>✖</w:t>
       </w:r>
       <w:r>
         <w:rPr>
@@ -7741,7 +8351,7 @@
         </w:rPr>
       </w:pPr>
       <w:bookmarkStart w:id="15" w:name="_Toc215868116"/>
-      <w:bookmarkStart w:id="16" w:name="_Toc216005721"/>
+      <w:bookmarkStart w:id="16" w:name="_Toc227670206"/>
       <w:r>
         <w:rPr>
           <w:color w:val="000000"/>
@@ -7789,7 +8399,35 @@
           <w:rFonts w:eastAsia="Calibri"/>
           <w:color w:val="000000" w:themeColor="text1"/>
         </w:rPr>
-        <w:t xml:space="preserve">The lifts are assessed to the latest requirements of the Lift Code AS 1735 together with the Work Health and Safety Act and DDA. </w:t>
+        <w:t xml:space="preserve">The lifts are assessed to the latest requirements of the </w:t>
+      </w:r>
+      <w:r>
+        <w:rPr>
+          <w:rFonts w:eastAsia="Calibri"/>
+          <w:color w:val="000000" w:themeColor="text1"/>
+        </w:rPr>
+        <w:t>l</w:t>
+      </w:r>
+      <w:r>
+        <w:rPr>
+          <w:rFonts w:eastAsia="Calibri"/>
+          <w:color w:val="000000" w:themeColor="text1"/>
+        </w:rPr>
+        <w:t xml:space="preserve">ift </w:t>
+      </w:r>
+      <w:r>
+        <w:rPr>
+          <w:rFonts w:eastAsia="Calibri"/>
+          <w:color w:val="000000" w:themeColor="text1"/>
+        </w:rPr>
+        <w:t>c</w:t>
+      </w:r>
+      <w:r>
+        <w:rPr>
+          <w:rFonts w:eastAsia="Calibri"/>
+          <w:color w:val="000000" w:themeColor="text1"/>
+        </w:rPr>
+        <w:t xml:space="preserve">ode AS 1735 together with the Work Health and Safety Act and DDA. </w:t>
       </w:r>
     </w:p>
     <w:p>
@@ -7807,7 +8445,35 @@
           <w:rFonts w:eastAsia="Calibri"/>
           <w:color w:val="000000" w:themeColor="text1"/>
         </w:rPr>
-        <w:t>Beyond code compliance we have assessed the installed equipment for further risk with compliance with the National Work Health and Safety (WH&amp;S) Act 2011 and corresponding Regulation.</w:t>
+        <w:t>Beyond code compliance</w:t>
+      </w:r>
+      <w:r>
+        <w:rPr>
+          <w:rFonts w:eastAsia="Calibri"/>
+          <w:color w:val="000000" w:themeColor="text1"/>
+        </w:rPr>
+        <w:t>,</w:t>
+      </w:r>
+      <w:r>
+        <w:rPr>
+          <w:rFonts w:eastAsia="Calibri"/>
+          <w:color w:val="000000" w:themeColor="text1"/>
+        </w:rPr>
+        <w:t xml:space="preserve"> we have assessed the installed equipment for further risk with compliance with the National Work Health and Safety (WH&amp;S) Act 2011 </w:t>
+      </w:r>
+      <w:r>
+        <w:rPr>
+          <w:rFonts w:eastAsia="Calibri"/>
+          <w:color w:val="000000" w:themeColor="text1"/>
+        </w:rPr>
+        <w:t>r</w:t>
+      </w:r>
+      <w:r>
+        <w:rPr>
+          <w:rFonts w:eastAsia="Calibri"/>
+          <w:color w:val="000000" w:themeColor="text1"/>
+        </w:rPr>
+        <w:t>egulation.</w:t>
       </w:r>
     </w:p>
     <w:p>
@@ -7893,7 +8559,35 @@
           <w:rFonts w:eastAsia="Calibri"/>
           <w:color w:val="000000" w:themeColor="text1"/>
         </w:rPr>
-        <w:t>The below items do not comply with Lift Code AS 1735.12 and DDA requirements:</w:t>
+        <w:t xml:space="preserve">The below items do not comply with </w:t>
+      </w:r>
+      <w:r>
+        <w:rPr>
+          <w:rFonts w:eastAsia="Calibri"/>
+          <w:color w:val="000000" w:themeColor="text1"/>
+        </w:rPr>
+        <w:t>l</w:t>
+      </w:r>
+      <w:r>
+        <w:rPr>
+          <w:rFonts w:eastAsia="Calibri"/>
+          <w:color w:val="000000" w:themeColor="text1"/>
+        </w:rPr>
+        <w:t xml:space="preserve">ift </w:t>
+      </w:r>
+      <w:r>
+        <w:rPr>
+          <w:rFonts w:eastAsia="Calibri"/>
+          <w:color w:val="000000" w:themeColor="text1"/>
+        </w:rPr>
+        <w:t>c</w:t>
+      </w:r>
+      <w:r>
+        <w:rPr>
+          <w:rFonts w:eastAsia="Calibri"/>
+          <w:color w:val="000000" w:themeColor="text1"/>
+        </w:rPr>
+        <w:t>ode AS 1735.12 and DDA requirements:</w:t>
       </w:r>
     </w:p>
     <w:p>
@@ -7983,7 +8677,7 @@
         </w:rPr>
       </w:pPr>
       <w:bookmarkStart w:id="17" w:name="_Toc215868117"/>
-      <w:bookmarkStart w:id="18" w:name="_Toc216005722"/>
+      <w:bookmarkStart w:id="18" w:name="_Toc227670207"/>
       <w:r>
         <w:rPr>
           <w:color w:val="000000"/>
@@ -8222,6 +8916,7 @@
         </w:rPr>
       </w:pPr>
       <w:bookmarkStart w:id="19" w:name="_Toc223977559"/>
+      <w:bookmarkStart w:id="20" w:name="_Toc227670208"/>
       <w:r>
         <w:rPr>
           <w:color w:val="000000"/>
@@ -8232,6 +8927,7 @@
         <w:t>RECOMMENDATIONS</w:t>
       </w:r>
       <w:bookmarkEnd w:id="19"/>
+      <w:bookmarkEnd w:id="20"/>
     </w:p>
     <w:p>
       <w:pPr>
@@ -8799,7 +9495,7 @@
                 <w:lang w:eastAsia="en-AU"/>
               </w:rPr>
             </w:pPr>
-            <w:bookmarkStart w:id="20" w:name="_Hlk215066351"/>
+            <w:bookmarkStart w:id="21" w:name="_Hlk215066351"/>
             <w:r>
               <w:rPr>
                 <w:b/>
@@ -9712,7 +10408,7 @@
         </w:tc>
       </w:tr>
     </w:tbl>
-    <w:bookmarkEnd w:id="20"/>
+    <w:bookmarkEnd w:id="21"/>
     <w:p>
       <w:pPr>
         <w:jc w:val="both"/>
@@ -10971,7 +11667,7 @@
           <w:szCs w:val="20"/>
         </w:rPr>
       </w:pPr>
-      <w:bookmarkStart w:id="21" w:name="_Toc216005723"/>
+      <w:bookmarkStart w:id="22" w:name="_Toc227670209"/>
       <w:r>
         <w:rPr>
           <w:color w:val="000000"/>
@@ -10980,7 +11676,7 @@
         </w:rPr>
         <w:t>SITE DETAILS</w:t>
       </w:r>
-      <w:bookmarkEnd w:id="21"/>
+      <w:bookmarkEnd w:id="22"/>
     </w:p>
     <w:p>
       <w:pPr>
@@ -11057,8 +11753,8 @@
           <w:szCs w:val="20"/>
         </w:rPr>
       </w:pPr>
-      <w:bookmarkStart w:id="22" w:name="_Toc215868118"/>
-      <w:bookmarkStart w:id="23" w:name="_Toc216005724"/>
+      <w:bookmarkStart w:id="23" w:name="_Toc215868118"/>
+      <w:bookmarkStart w:id="24" w:name="_Toc227670210"/>
       <w:r>
         <w:rPr>
           <w:color w:val="000000"/>
@@ -11067,8 +11763,8 @@
         </w:rPr>
         <w:t>DEFECTIVE ITEMS</w:t>
       </w:r>
-      <w:bookmarkEnd w:id="22"/>
       <w:bookmarkEnd w:id="23"/>
+      <w:bookmarkEnd w:id="24"/>
     </w:p>
     <w:p>
       <w:pPr>
@@ -11152,9 +11848,9 @@
         </w:rPr>
         <w:t>The Lift Contractor must complete these defects as a priority and must continue maintaining the equipment in safe working order and in accordance with current maintenance contract.</w:t>
       </w:r>
-      <w:bookmarkStart w:id="24" w:name="_Hlk162468892"/>
-    </w:p>
-    <w:bookmarkEnd w:id="24"/>
+      <w:bookmarkStart w:id="25" w:name="_Hlk162468892"/>
+    </w:p>
+    <w:bookmarkEnd w:id="25"/>
     <w:p>
       <w:pPr>
         <w:rPr>
@@ -11207,8 +11903,9 @@
           <w:szCs w:val="20"/>
         </w:rPr>
       </w:pPr>
-      <w:bookmarkStart w:id="25" w:name="_Toc223977562"/>
-      <w:bookmarkStart w:id="26" w:name="_Toc215077776"/>
+      <w:bookmarkStart w:id="26" w:name="_Toc223977562"/>
+      <w:bookmarkStart w:id="27" w:name="_Toc227670211"/>
+      <w:bookmarkStart w:id="28" w:name="_Toc215077776"/>
       <w:r>
         <w:rPr>
           <w:color w:val="000000"/>
@@ -11217,7 +11914,8 @@
         </w:rPr>
         <w:t>SITE IMAGES</w:t>
       </w:r>
-      <w:bookmarkEnd w:id="25"/>
+      <w:bookmarkEnd w:id="26"/>
+      <w:bookmarkEnd w:id="27"/>
     </w:p>
     <w:p>
       <w:pPr>
@@ -11239,7 +11937,7 @@
         </w:rPr>
       </w:pPr>
     </w:p>
-    <w:bookmarkEnd w:id="26"/>
+    <w:bookmarkEnd w:id="28"/>
     <w:p>
       <w:pPr>
         <w:spacing w:after="160" w:line="259" w:lineRule="auto"/>
@@ -12111,7 +12809,7 @@
         <v:path o:extrusionok="f" gradientshapeok="t" o:connecttype="rect"/>
         <o:lock v:ext="edit" aspectratio="t"/>
       </v:shapetype>
-      <v:shape id="_x0000_i1025" type="#_x0000_t75" style="width:100.5pt;height:47.5pt" o:bullet="t">
+      <v:shape id="_x0000_i1025" type="#_x0000_t75" style="width:100.65pt;height:47.35pt" o:bullet="t">
         <v:imagedata r:id="rId1" o:title="CMG Arrow"/>
       </v:shape>
     </w:pict>
@@ -14608,6 +15306,7 @@
   <w:style w:type="character" w:default="1" w:styleId="DefaultParagraphFont">
     <w:name w:val="Default Paragraph Font"/>
     <w:uiPriority w:val="1"/>
+    <w:semiHidden/>
     <w:unhideWhenUsed/>
   </w:style>
   <w:style w:type="table" w:default="1" w:styleId="TableNormal">
@@ -16111,6 +16810,25 @@
 </file>
 
 <file path=customXml/item1.xml><?xml version="1.0" encoding="utf-8"?>
+<b:Sources xmlns:b="http://schemas.openxmlformats.org/officeDocument/2006/bibliography" xmlns="http://schemas.openxmlformats.org/officeDocument/2006/bibliography" SelectedStyle="\APASixthEditionOfficeOnline.xsl" StyleName="APA" Version="6"/>
+</file>
+
+<file path=customXml/item2.xml><?xml version="1.0" encoding="utf-8"?>
+<go:gDocsCustomXmlDataStorage xmlns:go="http://customooxmlschemas.google.com/" xmlns:r="http://schemas.openxmlformats.org/officeDocument/2006/relationships" uri="GoogleDocsCustomDataVersion2">
+  <go:docsCustomData xmlns:go="http://customooxmlschemas.google.com/" roundtripDataSignature="AMtx7mjT00KyiMpCMVtmI0iilXRVRo+qBw==">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</go:docsCustomData>
+</go:gDocsCustomXmlDataStorage>
+</file>
+
+<file path=customXml/item3.xml><?xml version="1.0" encoding="utf-8"?>
+<?mso-contentType ?>
+<FormTemplates xmlns="http://schemas.microsoft.com/sharepoint/v3/contenttype/forms">
+  <Display>DocumentLibraryForm</Display>
+  <Edit>DocumentLibraryForm</Edit>
+  <New>DocumentLibraryForm</New>
+</FormTemplates>
+</file>
+
+<file path=customXml/item4.xml><?xml version="1.0" encoding="utf-8"?>
 <p:properties xmlns:p="http://schemas.microsoft.com/office/2006/metadata/properties" xmlns:xsi="http://www.w3.org/2001/XMLSchema-instance" xmlns:pc="http://schemas.microsoft.com/office/infopath/2007/PartnerControls">
   <documentManagement>
     <TaxCatchAll xmlns="e7e5e8d9-3acf-499a-b2ec-caee31267ae3" xsi:nil="true"/>
@@ -16121,7 +16839,7 @@
 </p:properties>
 </file>
 
-<file path=customXml/item2.xml><?xml version="1.0" encoding="utf-8"?>
+<file path=customXml/item5.xml><?xml version="1.0" encoding="utf-8"?>
 <ct:contentTypeSchema xmlns:ct="http://schemas.microsoft.com/office/2006/metadata/contentType" xmlns:ma="http://schemas.microsoft.com/office/2006/metadata/properties/metaAttributes" ct:_="" ma:_="" ma:contentTypeName="Document" ma:contentTypeID="0x0101001CACF5B7A58D554795A28E7DF1D45FB2" ma:contentTypeVersion="12" ma:contentTypeDescription="Create a new document." ma:contentTypeScope="" ma:versionID="5cfadec9bccf68338cdb162740d64a99">
   <xsd:schema xmlns:xsd="http://www.w3.org/2001/XMLSchema" xmlns:xs="http://www.w3.org/2001/XMLSchema" xmlns:p="http://schemas.microsoft.com/office/2006/metadata/properties" xmlns:ns2="63f055bc-48c0-461c-a5ed-e9ee69fac0bb" xmlns:ns3="e7e5e8d9-3acf-499a-b2ec-caee31267ae3" targetNamespace="http://schemas.microsoft.com/office/2006/metadata/properties" ma:root="true" ma:fieldsID="4484a2026f246cebba8b36372c5f3c56" ns2:_="" ns3:_="">
     <xsd:import namespace="63f055bc-48c0-461c-a5ed-e9ee69fac0bb"/>
@@ -16338,26 +17056,32 @@
 </ct:contentTypeSchema>
 </file>
 
-<file path=customXml/item3.xml><?xml version="1.0" encoding="utf-8"?>
-<b:Sources xmlns:b="http://schemas.openxmlformats.org/officeDocument/2006/bibliography" xmlns="http://schemas.openxmlformats.org/officeDocument/2006/bibliography" SelectedStyle="\APASixthEditionOfficeOnline.xsl" StyleName="APA" Version="6"/>
+<file path=customXml/itemProps1.xml><?xml version="1.0" encoding="utf-8"?>
+<ds:datastoreItem xmlns:ds="http://schemas.openxmlformats.org/officeDocument/2006/customXml" ds:itemID="{EB0E3FAB-D9C3-42C7-901A-DB2BE2C5D495}">
+  <ds:schemaRefs>
+    <ds:schemaRef ds:uri="http://schemas.openxmlformats.org/officeDocument/2006/bibliography"/>
+  </ds:schemaRefs>
+</ds:datastoreItem>
 </file>
 
-<file path=customXml/item4.xml><?xml version="1.0" encoding="utf-8"?>
-<go:gDocsCustomXmlDataStorage xmlns:go="http://customooxmlschemas.google.com/" xmlns:r="http://schemas.openxmlformats.org/officeDocument/2006/relationships" uri="GoogleDocsCustomDataVersion2">
-  <go:docsCustomData xmlns:go="http://customooxmlschemas.google.com/" roundtripDataSignature="AMtx7mjT00KyiMpCMVtmI0iilXRVRo+qBw==">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</go:docsCustomData>
-</go:gDocsCustomXmlDataStorage>
+<file path=customXml/itemProps2.xml><?xml version="1.0" encoding="utf-8"?>
+<ds:datastoreItem xmlns:ds="http://schemas.openxmlformats.org/officeDocument/2006/customXml" ds:itemID="{11111111-1234-1234-1234-123412341234}">
+  <ds:schemaRefs>
+    <ds:schemaRef ds:uri="http://customooxmlschemas.google.com/"/>
+    <ds:schemaRef ds:uri="http://schemas.openxmlformats.org/officeDocument/2006/relationships"/>
+  </ds:schemaRefs>
+</ds:datastoreItem>
 </file>
 
-<file path=customXml/item5.xml><?xml version="1.0" encoding="utf-8"?>
-<?mso-contentType ?>
-<FormTemplates xmlns="http://schemas.microsoft.com/sharepoint/v3/contenttype/forms">
-  <Display>DocumentLibraryForm</Display>
-  <Edit>DocumentLibraryForm</Edit>
-  <New>DocumentLibraryForm</New>
-</FormTemplates>
+<file path=customXml/itemProps3.xml><?xml version="1.0" encoding="utf-8"?>
+<ds:datastoreItem xmlns:ds="http://schemas.openxmlformats.org/officeDocument/2006/customXml" ds:itemID="{1A921F40-AE61-4521-8537-7B1DC1998BF7}">
+  <ds:schemaRefs>
+    <ds:schemaRef ds:uri="http://schemas.microsoft.com/sharepoint/v3/contenttype/forms"/>
+  </ds:schemaRefs>
+</ds:datastoreItem>
 </file>
 
-<file path=customXml/itemProps1.xml><?xml version="1.0" encoding="utf-8"?>
+<file path=customXml/itemProps4.xml><?xml version="1.0" encoding="utf-8"?>
 <ds:datastoreItem xmlns:ds="http://schemas.openxmlformats.org/officeDocument/2006/customXml" ds:itemID="{472B01B0-FA0C-4C92-BCA7-6F8FA7D66B27}">
   <ds:schemaRefs>
     <ds:schemaRef ds:uri="http://schemas.microsoft.com/office/2006/metadata/properties"/>
@@ -16368,7 +17092,7 @@
 </ds:datastoreItem>
 </file>
 
-<file path=customXml/itemProps2.xml><?xml version="1.0" encoding="utf-8"?>
+<file path=customXml/itemProps5.xml><?xml version="1.0" encoding="utf-8"?>
 <ds:datastoreItem xmlns:ds="http://schemas.openxmlformats.org/officeDocument/2006/customXml" ds:itemID="{FB1D13B2-4AB7-465A-859F-397A717B121C}">
   <ds:schemaRefs>
     <ds:schemaRef ds:uri="http://schemas.microsoft.com/office/2006/metadata/contentType"/>
@@ -16385,29 +17109,4 @@
     <ds:schemaRef ds:uri="http://schemas.microsoft.com/internal/obd"/>
   </ds:schemaRefs>
 </ds:datastoreItem>
-</file>
-
-<file path=customXml/itemProps3.xml><?xml version="1.0" encoding="utf-8"?>
-<ds:datastoreItem xmlns:ds="http://schemas.openxmlformats.org/officeDocument/2006/customXml" ds:itemID="{EB0E3FAB-D9C3-42C7-901A-DB2BE2C5D495}">
-  <ds:schemaRefs>
-    <ds:schemaRef ds:uri="http://schemas.openxmlformats.org/officeDocument/2006/bibliography"/>
-  </ds:schemaRefs>
-</ds:datastoreItem>
-</file>
-
-<file path=customXml/itemProps4.xml><?xml version="1.0" encoding="utf-8"?>
-<ds:datastoreItem xmlns:ds="http://schemas.openxmlformats.org/officeDocument/2006/customXml" ds:itemID="{11111111-1234-1234-1234-123412341234}">
-  <ds:schemaRefs>
-    <ds:schemaRef ds:uri="http://customooxmlschemas.google.com/"/>
-    <ds:schemaRef ds:uri="http://schemas.openxmlformats.org/officeDocument/2006/relationships"/>
-  </ds:schemaRefs>
-</ds:datastoreItem>
-</file>
-
-<file path=customXml/itemProps5.xml><?xml version="1.0" encoding="utf-8"?>
-<ds:datastoreItem xmlns:ds="http://schemas.openxmlformats.org/officeDocument/2006/customXml" ds:itemID="{1A921F40-AE61-4521-8537-7B1DC1998BF7}">
-  <ds:schemaRefs>
-    <ds:schemaRef ds:uri="http://schemas.microsoft.com/sharepoint/v3/contenttype/forms"/>
-  </ds:schemaRefs>
-</ds:datastoreItem>
 </file>
</xml_diff>